<commit_message>
Mark grading system as draft and add PDF study plan
</commit_message>
<xml_diff>
--- a/docs/kratkiy_uchebnyy_plan.docx
+++ b/docs/kratkiy_uchebnyy_plan.docx
@@ -3646,7 +3646,7 @@
         <w:keepNext/>
       </w:pPr>
       <w:r>
-        <w:t>Рейтинговая система</w:t>
+        <w:t>Система оценивания в разработке</w:t>
       </w:r>
     </w:p>
     <w:p>
@@ -3660,7 +3660,7 @@
           <w:color w:val="000000"/>
           <w:sz w:val="21"/>
         </w:rPr>
-        <w:t>Итоговый рейтинг формируется из результатов работы в течение семестра и экзамена.</w:t>
+        <w:t>Рейтинговая система и точное распределение баллов находятся в разработке. До утверждения документа приведённый ниже перечень отражает предполагаемые виды контроля без закрепления их удельного веса в итоговой оценке.</w:t>
       </w:r>
     </w:p>
     <w:tbl>
@@ -3681,7 +3681,7 @@
         </w:trPr>
         <w:tc>
           <w:tcPr>
-            <w:tcW w:type="dxa" w:w="2952"/>
+            <w:tcW w:type="dxa" w:w="2520"/>
             <w:vAlign w:val="center"/>
             <w:shd w:fill="17365D"/>
             <w:tcMar>
@@ -3717,7 +3717,7 @@
         </w:tc>
         <w:tc>
           <w:tcPr>
-            <w:tcW w:type="dxa" w:w="1080"/>
+            <w:tcW w:type="dxa" w:w="5976"/>
             <w:vAlign w:val="center"/>
             <w:shd w:fill="17365D"/>
             <w:tcMar>
@@ -3747,13 +3747,13 @@
                 <w:color w:val="FFFFFF"/>
                 <w:sz w:val="18"/>
               </w:rPr>
-              <w:t>Баллы</w:t>
+              <w:t>Что предполагается оценивать</w:t>
             </w:r>
           </w:p>
         </w:tc>
         <w:tc>
           <w:tcPr>
-            <w:tcW w:type="dxa" w:w="6048"/>
+            <w:tcW w:type="dxa" w:w="1584"/>
             <w:vAlign w:val="center"/>
             <w:shd w:fill="17365D"/>
             <w:tcMar>
@@ -3783,7 +3783,7 @@
                 <w:color w:val="FFFFFF"/>
                 <w:sz w:val="18"/>
               </w:rPr>
-              <w:t>Что оценивается</w:t>
+              <w:t>Статус</w:t>
             </w:r>
           </w:p>
         </w:tc>
@@ -3794,7 +3794,7 @@
         </w:trPr>
         <w:tc>
           <w:tcPr>
-            <w:tcW w:type="dxa" w:w="2952"/>
+            <w:tcW w:type="dxa" w:w="2520"/>
             <w:vAlign w:val="center"/>
             <w:shd w:fill="FFFFFF"/>
             <w:tcMar>
@@ -3830,7 +3830,43 @@
         </w:tc>
         <w:tc>
           <w:tcPr>
-            <w:tcW w:type="dxa" w:w="1080"/>
+            <w:tcW w:type="dxa" w:w="5976"/>
+            <w:vAlign w:val="center"/>
+            <w:shd w:fill="FFFFFF"/>
+            <w:tcMar>
+              <w:top w:w="100" w:type="dxa"/>
+              <w:start w:w="110" w:type="dxa"/>
+              <w:bottom w:w="100" w:type="dxa"/>
+              <w:end w:w="110" w:type="dxa"/>
+            </w:tcMar>
+            <w:tcBorders>
+              <w:top w:val="single" w:sz="6" w:color="D9D9D9"/>
+              <w:left w:val="single" w:sz="6" w:color="D9D9D9"/>
+              <w:bottom w:val="single" w:sz="6" w:color="D9D9D9"/>
+              <w:right w:val="single" w:sz="6" w:color="D9D9D9"/>
+              <w:insideH w:val="single" w:sz="6" w:color="D9D9D9"/>
+              <w:insideV w:val="single" w:sz="6" w:color="D9D9D9"/>
+            </w:tcBorders>
+          </w:tcPr>
+          <w:p>
+            <w:pPr>
+              <w:spacing w:after="0" w:line="247" w:lineRule="auto"/>
+              <w:jc w:val="left"/>
+            </w:pPr>
+            <w:r>
+              <w:rPr>
+                <w:rFonts w:ascii="Arial" w:hAnsi="Arial" w:eastAsia="Arial"/>
+                <w:b w:val="0"/>
+                <w:color w:val="000000"/>
+                <w:sz w:val="18"/>
+              </w:rPr>
+              <w:t>Работа на занятиях, корректность решения и содержательный вывод</w:t>
+            </w:r>
+          </w:p>
+        </w:tc>
+        <w:tc>
+          <w:tcPr>
+            <w:tcW w:type="dxa" w:w="1584"/>
             <w:vAlign w:val="center"/>
             <w:shd w:fill="FFFFFF"/>
             <w:tcMar>
@@ -3860,43 +3896,7 @@
                 <w:color w:val="000000"/>
                 <w:sz w:val="18"/>
               </w:rPr>
-              <w:t>15</w:t>
-            </w:r>
-          </w:p>
-        </w:tc>
-        <w:tc>
-          <w:tcPr>
-            <w:tcW w:type="dxa" w:w="6048"/>
-            <w:vAlign w:val="center"/>
-            <w:shd w:fill="FFFFFF"/>
-            <w:tcMar>
-              <w:top w:w="100" w:type="dxa"/>
-              <w:start w:w="110" w:type="dxa"/>
-              <w:bottom w:w="100" w:type="dxa"/>
-              <w:end w:w="110" w:type="dxa"/>
-            </w:tcMar>
-            <w:tcBorders>
-              <w:top w:val="single" w:sz="6" w:color="D9D9D9"/>
-              <w:left w:val="single" w:sz="6" w:color="D9D9D9"/>
-              <w:bottom w:val="single" w:sz="6" w:color="D9D9D9"/>
-              <w:right w:val="single" w:sz="6" w:color="D9D9D9"/>
-              <w:insideH w:val="single" w:sz="6" w:color="D9D9D9"/>
-              <w:insideV w:val="single" w:sz="6" w:color="D9D9D9"/>
-            </w:tcBorders>
-          </w:tcPr>
-          <w:p>
-            <w:pPr>
-              <w:spacing w:after="0" w:line="247" w:lineRule="auto"/>
-              <w:jc w:val="left"/>
-            </w:pPr>
-            <w:r>
-              <w:rPr>
-                <w:rFonts w:ascii="Arial" w:hAnsi="Arial" w:eastAsia="Arial"/>
-                <w:b w:val="0"/>
-                <w:color w:val="000000"/>
-                <w:sz w:val="18"/>
-              </w:rPr>
-              <w:t>Выполнение заданий, корректный результат, вывод и объяснение решения</w:t>
+              <w:t>В разработке</w:t>
             </w:r>
           </w:p>
         </w:tc>
@@ -3907,7 +3907,7 @@
         </w:trPr>
         <w:tc>
           <w:tcPr>
-            <w:tcW w:type="dxa" w:w="2952"/>
+            <w:tcW w:type="dxa" w:w="2520"/>
             <w:vAlign w:val="center"/>
             <w:shd w:fill="EAF2F8"/>
             <w:tcMar>
@@ -3937,49 +3937,13 @@
                 <w:color w:val="000000"/>
                 <w:sz w:val="18"/>
               </w:rPr>
-              <w:t>7 домашних заданий</w:t>
+              <w:t>Домашние задания</w:t>
             </w:r>
           </w:p>
         </w:tc>
         <w:tc>
           <w:tcPr>
-            <w:tcW w:type="dxa" w:w="1080"/>
-            <w:vAlign w:val="center"/>
-            <w:shd w:fill="EAF2F8"/>
-            <w:tcMar>
-              <w:top w:w="100" w:type="dxa"/>
-              <w:start w:w="110" w:type="dxa"/>
-              <w:bottom w:w="100" w:type="dxa"/>
-              <w:end w:w="110" w:type="dxa"/>
-            </w:tcMar>
-            <w:tcBorders>
-              <w:top w:val="single" w:sz="6" w:color="D9D9D9"/>
-              <w:left w:val="single" w:sz="6" w:color="D9D9D9"/>
-              <w:bottom w:val="single" w:sz="6" w:color="D9D9D9"/>
-              <w:right w:val="single" w:sz="6" w:color="D9D9D9"/>
-              <w:insideH w:val="single" w:sz="6" w:color="D9D9D9"/>
-              <w:insideV w:val="single" w:sz="6" w:color="D9D9D9"/>
-            </w:tcBorders>
-          </w:tcPr>
-          <w:p>
-            <w:pPr>
-              <w:spacing w:after="0" w:line="247" w:lineRule="auto"/>
-              <w:jc w:val="center"/>
-            </w:pPr>
-            <w:r>
-              <w:rPr>
-                <w:rFonts w:ascii="Arial" w:hAnsi="Arial" w:eastAsia="Arial"/>
-                <w:b w:val="0"/>
-                <w:color w:val="000000"/>
-                <w:sz w:val="18"/>
-              </w:rPr>
-              <w:t>30</w:t>
-            </w:r>
-          </w:p>
-        </w:tc>
-        <w:tc>
-          <w:tcPr>
-            <w:tcW w:type="dxa" w:w="6048"/>
+            <w:tcW w:type="dxa" w:w="5976"/>
             <w:vAlign w:val="center"/>
             <w:shd w:fill="EAF2F8"/>
             <w:tcMar>
@@ -4013,6 +3977,42 @@
             </w:r>
           </w:p>
         </w:tc>
+        <w:tc>
+          <w:tcPr>
+            <w:tcW w:type="dxa" w:w="1584"/>
+            <w:vAlign w:val="center"/>
+            <w:shd w:fill="EAF2F8"/>
+            <w:tcMar>
+              <w:top w:w="100" w:type="dxa"/>
+              <w:start w:w="110" w:type="dxa"/>
+              <w:bottom w:w="100" w:type="dxa"/>
+              <w:end w:w="110" w:type="dxa"/>
+            </w:tcMar>
+            <w:tcBorders>
+              <w:top w:val="single" w:sz="6" w:color="D9D9D9"/>
+              <w:left w:val="single" w:sz="6" w:color="D9D9D9"/>
+              <w:bottom w:val="single" w:sz="6" w:color="D9D9D9"/>
+              <w:right w:val="single" w:sz="6" w:color="D9D9D9"/>
+              <w:insideH w:val="single" w:sz="6" w:color="D9D9D9"/>
+              <w:insideV w:val="single" w:sz="6" w:color="D9D9D9"/>
+            </w:tcBorders>
+          </w:tcPr>
+          <w:p>
+            <w:pPr>
+              <w:spacing w:after="0" w:line="247" w:lineRule="auto"/>
+              <w:jc w:val="center"/>
+            </w:pPr>
+            <w:r>
+              <w:rPr>
+                <w:rFonts w:ascii="Arial" w:hAnsi="Arial" w:eastAsia="Arial"/>
+                <w:b w:val="0"/>
+                <w:color w:val="000000"/>
+                <w:sz w:val="18"/>
+              </w:rPr>
+              <w:t>В разработке</w:t>
+            </w:r>
+          </w:p>
+        </w:tc>
       </w:tr>
       <w:tr>
         <w:trPr>
@@ -4020,7 +4020,7 @@
         </w:trPr>
         <w:tc>
           <w:tcPr>
-            <w:tcW w:type="dxa" w:w="2952"/>
+            <w:tcW w:type="dxa" w:w="2520"/>
             <w:vAlign w:val="center"/>
             <w:shd w:fill="FFFFFF"/>
             <w:tcMar>
@@ -4050,49 +4050,13 @@
                 <w:color w:val="000000"/>
                 <w:sz w:val="18"/>
               </w:rPr>
-              <w:t>4 ML-квиза</w:t>
+              <w:t>ML-квизы</w:t>
             </w:r>
           </w:p>
         </w:tc>
         <w:tc>
           <w:tcPr>
-            <w:tcW w:type="dxa" w:w="1080"/>
-            <w:vAlign w:val="center"/>
-            <w:shd w:fill="FFFFFF"/>
-            <w:tcMar>
-              <w:top w:w="100" w:type="dxa"/>
-              <w:start w:w="110" w:type="dxa"/>
-              <w:bottom w:w="100" w:type="dxa"/>
-              <w:end w:w="110" w:type="dxa"/>
-            </w:tcMar>
-            <w:tcBorders>
-              <w:top w:val="single" w:sz="6" w:color="D9D9D9"/>
-              <w:left w:val="single" w:sz="6" w:color="D9D9D9"/>
-              <w:bottom w:val="single" w:sz="6" w:color="D9D9D9"/>
-              <w:right w:val="single" w:sz="6" w:color="D9D9D9"/>
-              <w:insideH w:val="single" w:sz="6" w:color="D9D9D9"/>
-              <w:insideV w:val="single" w:sz="6" w:color="D9D9D9"/>
-            </w:tcBorders>
-          </w:tcPr>
-          <w:p>
-            <w:pPr>
-              <w:spacing w:after="0" w:line="247" w:lineRule="auto"/>
-              <w:jc w:val="center"/>
-            </w:pPr>
-            <w:r>
-              <w:rPr>
-                <w:rFonts w:ascii="Arial" w:hAnsi="Arial" w:eastAsia="Arial"/>
-                <w:b w:val="0"/>
-                <w:color w:val="000000"/>
-                <w:sz w:val="18"/>
-              </w:rPr>
-              <w:t>8</w:t>
-            </w:r>
-          </w:p>
-        </w:tc>
-        <w:tc>
-          <w:tcPr>
-            <w:tcW w:type="dxa" w:w="6048"/>
+            <w:tcW w:type="dxa" w:w="5976"/>
             <w:vAlign w:val="center"/>
             <w:shd w:fill="FFFFFF"/>
             <w:tcMar>
@@ -4126,6 +4090,42 @@
             </w:r>
           </w:p>
         </w:tc>
+        <w:tc>
+          <w:tcPr>
+            <w:tcW w:type="dxa" w:w="1584"/>
+            <w:vAlign w:val="center"/>
+            <w:shd w:fill="FFFFFF"/>
+            <w:tcMar>
+              <w:top w:w="100" w:type="dxa"/>
+              <w:start w:w="110" w:type="dxa"/>
+              <w:bottom w:w="100" w:type="dxa"/>
+              <w:end w:w="110" w:type="dxa"/>
+            </w:tcMar>
+            <w:tcBorders>
+              <w:top w:val="single" w:sz="6" w:color="D9D9D9"/>
+              <w:left w:val="single" w:sz="6" w:color="D9D9D9"/>
+              <w:bottom w:val="single" w:sz="6" w:color="D9D9D9"/>
+              <w:right w:val="single" w:sz="6" w:color="D9D9D9"/>
+              <w:insideH w:val="single" w:sz="6" w:color="D9D9D9"/>
+              <w:insideV w:val="single" w:sz="6" w:color="D9D9D9"/>
+            </w:tcBorders>
+          </w:tcPr>
+          <w:p>
+            <w:pPr>
+              <w:spacing w:after="0" w:line="247" w:lineRule="auto"/>
+              <w:jc w:val="center"/>
+            </w:pPr>
+            <w:r>
+              <w:rPr>
+                <w:rFonts w:ascii="Arial" w:hAnsi="Arial" w:eastAsia="Arial"/>
+                <w:b w:val="0"/>
+                <w:color w:val="000000"/>
+                <w:sz w:val="18"/>
+              </w:rPr>
+              <w:t>В разработке</w:t>
+            </w:r>
+          </w:p>
+        </w:tc>
       </w:tr>
       <w:tr>
         <w:trPr>
@@ -4133,7 +4133,7 @@
         </w:trPr>
         <w:tc>
           <w:tcPr>
-            <w:tcW w:type="dxa" w:w="2952"/>
+            <w:tcW w:type="dxa" w:w="2520"/>
             <w:vAlign w:val="center"/>
             <w:shd w:fill="EAF2F8"/>
             <w:tcMar>
@@ -4163,13 +4163,49 @@
                 <w:color w:val="000000"/>
                 <w:sz w:val="18"/>
               </w:rPr>
-              <w:t>5 мини-собеседований</w:t>
+              <w:t>Мини-собеседования</w:t>
             </w:r>
           </w:p>
         </w:tc>
         <w:tc>
           <w:tcPr>
-            <w:tcW w:type="dxa" w:w="1080"/>
+            <w:tcW w:type="dxa" w:w="5976"/>
+            <w:vAlign w:val="center"/>
+            <w:shd w:fill="EAF2F8"/>
+            <w:tcMar>
+              <w:top w:w="100" w:type="dxa"/>
+              <w:start w:w="110" w:type="dxa"/>
+              <w:bottom w:w="100" w:type="dxa"/>
+              <w:end w:w="110" w:type="dxa"/>
+            </w:tcMar>
+            <w:tcBorders>
+              <w:top w:val="single" w:sz="6" w:color="D9D9D9"/>
+              <w:left w:val="single" w:sz="6" w:color="D9D9D9"/>
+              <w:bottom w:val="single" w:sz="6" w:color="D9D9D9"/>
+              <w:right w:val="single" w:sz="6" w:color="D9D9D9"/>
+              <w:insideH w:val="single" w:sz="6" w:color="D9D9D9"/>
+              <w:insideV w:val="single" w:sz="6" w:color="D9D9D9"/>
+            </w:tcBorders>
+          </w:tcPr>
+          <w:p>
+            <w:pPr>
+              <w:spacing w:after="0" w:line="247" w:lineRule="auto"/>
+              <w:jc w:val="left"/>
+            </w:pPr>
+            <w:r>
+              <w:rPr>
+                <w:rFonts w:ascii="Arial" w:hAnsi="Arial" w:eastAsia="Arial"/>
+                <w:b w:val="0"/>
+                <w:color w:val="000000"/>
+                <w:sz w:val="18"/>
+              </w:rPr>
+              <w:t>Устные ответы по алгоритмам и прикладным ML-ситуациям</w:t>
+            </w:r>
+          </w:p>
+        </w:tc>
+        <w:tc>
+          <w:tcPr>
+            <w:tcW w:type="dxa" w:w="1584"/>
             <w:vAlign w:val="center"/>
             <w:shd w:fill="EAF2F8"/>
             <w:tcMar>
@@ -4199,43 +4235,7 @@
                 <w:color w:val="000000"/>
                 <w:sz w:val="18"/>
               </w:rPr>
-              <w:t>5</w:t>
-            </w:r>
-          </w:p>
-        </w:tc>
-        <w:tc>
-          <w:tcPr>
-            <w:tcW w:type="dxa" w:w="6048"/>
-            <w:vAlign w:val="center"/>
-            <w:shd w:fill="EAF2F8"/>
-            <w:tcMar>
-              <w:top w:w="100" w:type="dxa"/>
-              <w:start w:w="110" w:type="dxa"/>
-              <w:bottom w:w="100" w:type="dxa"/>
-              <w:end w:w="110" w:type="dxa"/>
-            </w:tcMar>
-            <w:tcBorders>
-              <w:top w:val="single" w:sz="6" w:color="D9D9D9"/>
-              <w:left w:val="single" w:sz="6" w:color="D9D9D9"/>
-              <w:bottom w:val="single" w:sz="6" w:color="D9D9D9"/>
-              <w:right w:val="single" w:sz="6" w:color="D9D9D9"/>
-              <w:insideH w:val="single" w:sz="6" w:color="D9D9D9"/>
-              <w:insideV w:val="single" w:sz="6" w:color="D9D9D9"/>
-            </w:tcBorders>
-          </w:tcPr>
-          <w:p>
-            <w:pPr>
-              <w:spacing w:after="0" w:line="247" w:lineRule="auto"/>
-              <w:jc w:val="left"/>
-            </w:pPr>
-            <w:r>
-              <w:rPr>
-                <w:rFonts w:ascii="Arial" w:hAnsi="Arial" w:eastAsia="Arial"/>
-                <w:b w:val="0"/>
-                <w:color w:val="000000"/>
-                <w:sz w:val="18"/>
-              </w:rPr>
-              <w:t>Устные ответы по основным алгоритмам и ML-ситуациям</w:t>
+              <w:t>В разработке</w:t>
             </w:r>
           </w:p>
         </w:tc>
@@ -4246,7 +4246,7 @@
         </w:trPr>
         <w:tc>
           <w:tcPr>
-            <w:tcW w:type="dxa" w:w="2952"/>
+            <w:tcW w:type="dxa" w:w="2520"/>
             <w:vAlign w:val="center"/>
             <w:shd w:fill="FFFFFF"/>
             <w:tcMar>
@@ -4282,7 +4282,43 @@
         </w:tc>
         <w:tc>
           <w:tcPr>
-            <w:tcW w:type="dxa" w:w="1080"/>
+            <w:tcW w:type="dxa" w:w="5976"/>
+            <w:vAlign w:val="center"/>
+            <w:shd w:fill="FFFFFF"/>
+            <w:tcMar>
+              <w:top w:w="100" w:type="dxa"/>
+              <w:start w:w="110" w:type="dxa"/>
+              <w:bottom w:w="100" w:type="dxa"/>
+              <w:end w:w="110" w:type="dxa"/>
+            </w:tcMar>
+            <w:tcBorders>
+              <w:top w:val="single" w:sz="6" w:color="D9D9D9"/>
+              <w:left w:val="single" w:sz="6" w:color="D9D9D9"/>
+              <w:bottom w:val="single" w:sz="6" w:color="D9D9D9"/>
+              <w:right w:val="single" w:sz="6" w:color="D9D9D9"/>
+              <w:insideH w:val="single" w:sz="6" w:color="D9D9D9"/>
+              <w:insideV w:val="single" w:sz="6" w:color="D9D9D9"/>
+            </w:tcBorders>
+          </w:tcPr>
+          <w:p>
+            <w:pPr>
+              <w:spacing w:after="0" w:line="247" w:lineRule="auto"/>
+              <w:jc w:val="left"/>
+            </w:pPr>
+            <w:r>
+              <w:rPr>
+                <w:rFonts w:ascii="Arial" w:hAnsi="Arial" w:eastAsia="Arial"/>
+                <w:b w:val="0"/>
+                <w:color w:val="000000"/>
+                <w:sz w:val="18"/>
+              </w:rPr>
+              <w:t>Валидация, модели, эксперименты и итоговый отчёт</w:t>
+            </w:r>
+          </w:p>
+        </w:tc>
+        <w:tc>
+          <w:tcPr>
+            <w:tcW w:type="dxa" w:w="1584"/>
             <w:vAlign w:val="center"/>
             <w:shd w:fill="FFFFFF"/>
             <w:tcMar>
@@ -4312,43 +4348,7 @@
                 <w:color w:val="000000"/>
                 <w:sz w:val="18"/>
               </w:rPr>
-              <w:t>10</w:t>
-            </w:r>
-          </w:p>
-        </w:tc>
-        <w:tc>
-          <w:tcPr>
-            <w:tcW w:type="dxa" w:w="6048"/>
-            <w:vAlign w:val="center"/>
-            <w:shd w:fill="FFFFFF"/>
-            <w:tcMar>
-              <w:top w:w="100" w:type="dxa"/>
-              <w:start w:w="110" w:type="dxa"/>
-              <w:bottom w:w="100" w:type="dxa"/>
-              <w:end w:w="110" w:type="dxa"/>
-            </w:tcMar>
-            <w:tcBorders>
-              <w:top w:val="single" w:sz="6" w:color="D9D9D9"/>
-              <w:left w:val="single" w:sz="6" w:color="D9D9D9"/>
-              <w:bottom w:val="single" w:sz="6" w:color="D9D9D9"/>
-              <w:right w:val="single" w:sz="6" w:color="D9D9D9"/>
-              <w:insideH w:val="single" w:sz="6" w:color="D9D9D9"/>
-              <w:insideV w:val="single" w:sz="6" w:color="D9D9D9"/>
-            </w:tcBorders>
-          </w:tcPr>
-          <w:p>
-            <w:pPr>
-              <w:spacing w:after="0" w:line="247" w:lineRule="auto"/>
-              <w:jc w:val="left"/>
-            </w:pPr>
-            <w:r>
-              <w:rPr>
-                <w:rFonts w:ascii="Arial" w:hAnsi="Arial" w:eastAsia="Arial"/>
-                <w:b w:val="0"/>
-                <w:color w:val="000000"/>
-                <w:sz w:val="18"/>
-              </w:rPr>
-              <w:t>Валидация, модели, эксперименты, feature engineering и итоговый отчёт</w:t>
+              <w:t>В разработке</w:t>
             </w:r>
           </w:p>
         </w:tc>
@@ -4359,7 +4359,7 @@
         </w:trPr>
         <w:tc>
           <w:tcPr>
-            <w:tcW w:type="dxa" w:w="2952"/>
+            <w:tcW w:type="dxa" w:w="2520"/>
             <w:vAlign w:val="center"/>
             <w:shd w:fill="EAF2F8"/>
             <w:tcMar>
@@ -4395,43 +4395,7 @@
         </w:tc>
         <w:tc>
           <w:tcPr>
-            <w:tcW w:type="dxa" w:w="1080"/>
-            <w:vAlign w:val="center"/>
-            <w:shd w:fill="EAF2F8"/>
-            <w:tcMar>
-              <w:top w:w="100" w:type="dxa"/>
-              <w:start w:w="110" w:type="dxa"/>
-              <w:bottom w:w="100" w:type="dxa"/>
-              <w:end w:w="110" w:type="dxa"/>
-            </w:tcMar>
-            <w:tcBorders>
-              <w:top w:val="single" w:sz="6" w:color="D9D9D9"/>
-              <w:left w:val="single" w:sz="6" w:color="D9D9D9"/>
-              <w:bottom w:val="single" w:sz="6" w:color="D9D9D9"/>
-              <w:right w:val="single" w:sz="6" w:color="D9D9D9"/>
-              <w:insideH w:val="single" w:sz="6" w:color="D9D9D9"/>
-              <w:insideV w:val="single" w:sz="6" w:color="D9D9D9"/>
-            </w:tcBorders>
-          </w:tcPr>
-          <w:p>
-            <w:pPr>
-              <w:spacing w:after="0" w:line="247" w:lineRule="auto"/>
-              <w:jc w:val="center"/>
-            </w:pPr>
-            <w:r>
-              <w:rPr>
-                <w:rFonts w:ascii="Arial" w:hAnsi="Arial" w:eastAsia="Arial"/>
-                <w:b w:val="0"/>
-                <w:color w:val="000000"/>
-                <w:sz w:val="18"/>
-              </w:rPr>
-              <w:t>12</w:t>
-            </w:r>
-          </w:p>
-        </w:tc>
-        <w:tc>
-          <w:tcPr>
-            <w:tcW w:type="dxa" w:w="6048"/>
+            <w:tcW w:type="dxa" w:w="5976"/>
             <w:vAlign w:val="center"/>
             <w:shd w:fill="EAF2F8"/>
             <w:tcMar>
@@ -4465,6 +4429,42 @@
             </w:r>
           </w:p>
         </w:tc>
+        <w:tc>
+          <w:tcPr>
+            <w:tcW w:type="dxa" w:w="1584"/>
+            <w:vAlign w:val="center"/>
+            <w:shd w:fill="EAF2F8"/>
+            <w:tcMar>
+              <w:top w:w="100" w:type="dxa"/>
+              <w:start w:w="110" w:type="dxa"/>
+              <w:bottom w:w="100" w:type="dxa"/>
+              <w:end w:w="110" w:type="dxa"/>
+            </w:tcMar>
+            <w:tcBorders>
+              <w:top w:val="single" w:sz="6" w:color="D9D9D9"/>
+              <w:left w:val="single" w:sz="6" w:color="D9D9D9"/>
+              <w:bottom w:val="single" w:sz="6" w:color="D9D9D9"/>
+              <w:right w:val="single" w:sz="6" w:color="D9D9D9"/>
+              <w:insideH w:val="single" w:sz="6" w:color="D9D9D9"/>
+              <w:insideV w:val="single" w:sz="6" w:color="D9D9D9"/>
+            </w:tcBorders>
+          </w:tcPr>
+          <w:p>
+            <w:pPr>
+              <w:spacing w:after="0" w:line="247" w:lineRule="auto"/>
+              <w:jc w:val="center"/>
+            </w:pPr>
+            <w:r>
+              <w:rPr>
+                <w:rFonts w:ascii="Arial" w:hAnsi="Arial" w:eastAsia="Arial"/>
+                <w:b w:val="0"/>
+                <w:color w:val="000000"/>
+                <w:sz w:val="18"/>
+              </w:rPr>
+              <w:t>В разработке</w:t>
+            </w:r>
+          </w:p>
+        </w:tc>
       </w:tr>
       <w:tr>
         <w:trPr>
@@ -4472,7 +4472,7 @@
         </w:trPr>
         <w:tc>
           <w:tcPr>
-            <w:tcW w:type="dxa" w:w="2952"/>
+            <w:tcW w:type="dxa" w:w="2520"/>
             <w:vAlign w:val="center"/>
             <w:shd w:fill="FFFFFF"/>
             <w:tcMar>
@@ -4508,7 +4508,43 @@
         </w:tc>
         <w:tc>
           <w:tcPr>
-            <w:tcW w:type="dxa" w:w="1080"/>
+            <w:tcW w:type="dxa" w:w="5976"/>
+            <w:vAlign w:val="center"/>
+            <w:shd w:fill="FFFFFF"/>
+            <w:tcMar>
+              <w:top w:w="100" w:type="dxa"/>
+              <w:start w:w="110" w:type="dxa"/>
+              <w:bottom w:w="100" w:type="dxa"/>
+              <w:end w:w="110" w:type="dxa"/>
+            </w:tcMar>
+            <w:tcBorders>
+              <w:top w:val="single" w:sz="6" w:color="D9D9D9"/>
+              <w:left w:val="single" w:sz="6" w:color="D9D9D9"/>
+              <w:bottom w:val="single" w:sz="6" w:color="D9D9D9"/>
+              <w:right w:val="single" w:sz="6" w:color="D9D9D9"/>
+              <w:insideH w:val="single" w:sz="6" w:color="D9D9D9"/>
+              <w:insideV w:val="single" w:sz="6" w:color="D9D9D9"/>
+            </w:tcBorders>
+          </w:tcPr>
+          <w:p>
+            <w:pPr>
+              <w:spacing w:after="0" w:line="247" w:lineRule="auto"/>
+              <w:jc w:val="left"/>
+            </w:pPr>
+            <w:r>
+              <w:rPr>
+                <w:rFonts w:ascii="Arial" w:hAnsi="Arial" w:eastAsia="Arial"/>
+                <w:b w:val="0"/>
+                <w:color w:val="000000"/>
+                <w:sz w:val="18"/>
+              </w:rPr>
+              <w:t>Теория, прикладная ML-ситуация и анализ результатов</w:t>
+            </w:r>
+          </w:p>
+        </w:tc>
+        <w:tc>
+          <w:tcPr>
+            <w:tcW w:type="dxa" w:w="1584"/>
             <w:vAlign w:val="center"/>
             <w:shd w:fill="FFFFFF"/>
             <w:tcMar>
@@ -4538,156 +4574,7 @@
                 <w:color w:val="000000"/>
                 <w:sz w:val="18"/>
               </w:rPr>
-              <w:t>20</w:t>
-            </w:r>
-          </w:p>
-        </w:tc>
-        <w:tc>
-          <w:tcPr>
-            <w:tcW w:type="dxa" w:w="6048"/>
-            <w:vAlign w:val="center"/>
-            <w:shd w:fill="FFFFFF"/>
-            <w:tcMar>
-              <w:top w:w="100" w:type="dxa"/>
-              <w:start w:w="110" w:type="dxa"/>
-              <w:bottom w:w="100" w:type="dxa"/>
-              <w:end w:w="110" w:type="dxa"/>
-            </w:tcMar>
-            <w:tcBorders>
-              <w:top w:val="single" w:sz="6" w:color="D9D9D9"/>
-              <w:left w:val="single" w:sz="6" w:color="D9D9D9"/>
-              <w:bottom w:val="single" w:sz="6" w:color="D9D9D9"/>
-              <w:right w:val="single" w:sz="6" w:color="D9D9D9"/>
-              <w:insideH w:val="single" w:sz="6" w:color="D9D9D9"/>
-              <w:insideV w:val="single" w:sz="6" w:color="D9D9D9"/>
-            </w:tcBorders>
-          </w:tcPr>
-          <w:p>
-            <w:pPr>
-              <w:spacing w:after="0" w:line="247" w:lineRule="auto"/>
-              <w:jc w:val="left"/>
-            </w:pPr>
-            <w:r>
-              <w:rPr>
-                <w:rFonts w:ascii="Arial" w:hAnsi="Arial" w:eastAsia="Arial"/>
-                <w:b w:val="0"/>
-                <w:color w:val="000000"/>
-                <w:sz w:val="18"/>
-              </w:rPr>
-              <w:t>Алгоритм, прикладная ML-ситуация и анализ результатов</w:t>
-            </w:r>
-          </w:p>
-        </w:tc>
-      </w:tr>
-      <w:tr>
-        <w:trPr>
-          <w:cantSplit/>
-        </w:trPr>
-        <w:tc>
-          <w:tcPr>
-            <w:tcW w:type="dxa" w:w="2952"/>
-            <w:vAlign w:val="center"/>
-            <w:shd w:fill="DCE6F1"/>
-            <w:tcMar>
-              <w:top w:w="100" w:type="dxa"/>
-              <w:start w:w="110" w:type="dxa"/>
-              <w:bottom w:w="100" w:type="dxa"/>
-              <w:end w:w="110" w:type="dxa"/>
-            </w:tcMar>
-            <w:tcBorders>
-              <w:top w:val="single" w:sz="6" w:color="D9D9D9"/>
-              <w:left w:val="single" w:sz="6" w:color="D9D9D9"/>
-              <w:bottom w:val="single" w:sz="6" w:color="D9D9D9"/>
-              <w:right w:val="single" w:sz="6" w:color="D9D9D9"/>
-              <w:insideH w:val="single" w:sz="6" w:color="D9D9D9"/>
-              <w:insideV w:val="single" w:sz="6" w:color="D9D9D9"/>
-            </w:tcBorders>
-          </w:tcPr>
-          <w:p>
-            <w:pPr>
-              <w:spacing w:after="0" w:line="247" w:lineRule="auto"/>
-              <w:jc w:val="left"/>
-            </w:pPr>
-            <w:r>
-              <w:rPr>
-                <w:rFonts w:ascii="Arial" w:hAnsi="Arial" w:eastAsia="Arial"/>
-                <w:b/>
-                <w:color w:val="000000"/>
-                <w:sz w:val="18"/>
-              </w:rPr>
-              <w:t>Итого</w:t>
-            </w:r>
-          </w:p>
-        </w:tc>
-        <w:tc>
-          <w:tcPr>
-            <w:tcW w:type="dxa" w:w="1080"/>
-            <w:vAlign w:val="center"/>
-            <w:shd w:fill="DCE6F1"/>
-            <w:tcMar>
-              <w:top w:w="100" w:type="dxa"/>
-              <w:start w:w="110" w:type="dxa"/>
-              <w:bottom w:w="100" w:type="dxa"/>
-              <w:end w:w="110" w:type="dxa"/>
-            </w:tcMar>
-            <w:tcBorders>
-              <w:top w:val="single" w:sz="6" w:color="D9D9D9"/>
-              <w:left w:val="single" w:sz="6" w:color="D9D9D9"/>
-              <w:bottom w:val="single" w:sz="6" w:color="D9D9D9"/>
-              <w:right w:val="single" w:sz="6" w:color="D9D9D9"/>
-              <w:insideH w:val="single" w:sz="6" w:color="D9D9D9"/>
-              <w:insideV w:val="single" w:sz="6" w:color="D9D9D9"/>
-            </w:tcBorders>
-          </w:tcPr>
-          <w:p>
-            <w:pPr>
-              <w:spacing w:after="0" w:line="247" w:lineRule="auto"/>
-              <w:jc w:val="center"/>
-            </w:pPr>
-            <w:r>
-              <w:rPr>
-                <w:rFonts w:ascii="Arial" w:hAnsi="Arial" w:eastAsia="Arial"/>
-                <w:b/>
-                <w:color w:val="000000"/>
-                <w:sz w:val="18"/>
-              </w:rPr>
-              <w:t>100</w:t>
-            </w:r>
-          </w:p>
-        </w:tc>
-        <w:tc>
-          <w:tcPr>
-            <w:tcW w:type="dxa" w:w="6048"/>
-            <w:vAlign w:val="center"/>
-            <w:shd w:fill="DCE6F1"/>
-            <w:tcMar>
-              <w:top w:w="100" w:type="dxa"/>
-              <w:start w:w="110" w:type="dxa"/>
-              <w:bottom w:w="100" w:type="dxa"/>
-              <w:end w:w="110" w:type="dxa"/>
-            </w:tcMar>
-            <w:tcBorders>
-              <w:top w:val="single" w:sz="6" w:color="D9D9D9"/>
-              <w:left w:val="single" w:sz="6" w:color="D9D9D9"/>
-              <w:bottom w:val="single" w:sz="6" w:color="D9D9D9"/>
-              <w:right w:val="single" w:sz="6" w:color="D9D9D9"/>
-              <w:insideH w:val="single" w:sz="6" w:color="D9D9D9"/>
-              <w:insideV w:val="single" w:sz="6" w:color="D9D9D9"/>
-            </w:tcBorders>
-          </w:tcPr>
-          <w:p>
-            <w:pPr>
-              <w:spacing w:after="0" w:line="247" w:lineRule="auto"/>
-              <w:jc w:val="left"/>
-            </w:pPr>
-            <w:r>
-              <w:rPr>
-                <w:rFonts w:ascii="Arial" w:hAnsi="Arial" w:eastAsia="Arial"/>
-                <w:b/>
-                <w:color w:val="000000"/>
-                <w:sz w:val="18"/>
-              </w:rPr>
-              <w:t>Максимальный основной рейтинг</w:t>
+              <w:t>В разработке</w:t>
             </w:r>
           </w:p>
         </w:tc>
@@ -4761,7 +4648,7 @@
         </w:tc>
         <w:tc>
           <w:tcPr>
-            <w:tcW w:type="dxa" w:w="7704"/>
+            <w:tcW w:type="dxa" w:w="7128"/>
             <w:vAlign w:val="center"/>
             <w:shd w:fill="17365D"/>
             <w:tcMar>
@@ -4791,13 +4678,13 @@
                 <w:color w:val="FFFFFF"/>
                 <w:sz w:val="18"/>
               </w:rPr>
-              <w:t>Тема</w:t>
+              <w:t>Предварительная тема</w:t>
             </w:r>
           </w:p>
         </w:tc>
         <w:tc>
           <w:tcPr>
-            <w:tcW w:type="dxa" w:w="1224"/>
+            <w:tcW w:type="dxa" w:w="1800"/>
             <w:vAlign w:val="center"/>
             <w:shd w:fill="17365D"/>
             <w:tcMar>
@@ -4874,7 +4761,7 @@
         </w:tc>
         <w:tc>
           <w:tcPr>
-            <w:tcW w:type="dxa" w:w="7704"/>
+            <w:tcW w:type="dxa" w:w="7128"/>
             <w:vAlign w:val="center"/>
             <w:shd w:fill="FFFFFF"/>
             <w:tcMar>
@@ -4910,7 +4797,7 @@
         </w:tc>
         <w:tc>
           <w:tcPr>
-            <w:tcW w:type="dxa" w:w="1224"/>
+            <w:tcW w:type="dxa" w:w="1800"/>
             <w:vAlign w:val="center"/>
             <w:shd w:fill="FFFFFF"/>
             <w:tcMar>
@@ -4940,7 +4827,7 @@
                 <w:color w:val="000000"/>
                 <w:sz w:val="18"/>
               </w:rPr>
-              <w:t>3</w:t>
+              <w:t>Уточняются</w:t>
             </w:r>
           </w:p>
         </w:tc>
@@ -4987,7 +4874,7 @@
         </w:tc>
         <w:tc>
           <w:tcPr>
-            <w:tcW w:type="dxa" w:w="7704"/>
+            <w:tcW w:type="dxa" w:w="7128"/>
             <w:vAlign w:val="center"/>
             <w:shd w:fill="EAF2F8"/>
             <w:tcMar>
@@ -5023,7 +4910,7 @@
         </w:tc>
         <w:tc>
           <w:tcPr>
-            <w:tcW w:type="dxa" w:w="1224"/>
+            <w:tcW w:type="dxa" w:w="1800"/>
             <w:vAlign w:val="center"/>
             <w:shd w:fill="EAF2F8"/>
             <w:tcMar>
@@ -5053,7 +4940,7 @@
                 <w:color w:val="000000"/>
                 <w:sz w:val="18"/>
               </w:rPr>
-              <w:t>4</w:t>
+              <w:t>Уточняются</w:t>
             </w:r>
           </w:p>
         </w:tc>
@@ -5100,7 +4987,7 @@
         </w:tc>
         <w:tc>
           <w:tcPr>
-            <w:tcW w:type="dxa" w:w="7704"/>
+            <w:tcW w:type="dxa" w:w="7128"/>
             <w:vAlign w:val="center"/>
             <w:shd w:fill="FFFFFF"/>
             <w:tcMar>
@@ -5136,7 +5023,7 @@
         </w:tc>
         <w:tc>
           <w:tcPr>
-            <w:tcW w:type="dxa" w:w="1224"/>
+            <w:tcW w:type="dxa" w:w="1800"/>
             <w:vAlign w:val="center"/>
             <w:shd w:fill="FFFFFF"/>
             <w:tcMar>
@@ -5166,7 +5053,7 @@
                 <w:color w:val="000000"/>
                 <w:sz w:val="18"/>
               </w:rPr>
-              <w:t>5</w:t>
+              <w:t>Уточняются</w:t>
             </w:r>
           </w:p>
         </w:tc>
@@ -5213,7 +5100,7 @@
         </w:tc>
         <w:tc>
           <w:tcPr>
-            <w:tcW w:type="dxa" w:w="7704"/>
+            <w:tcW w:type="dxa" w:w="7128"/>
             <w:vAlign w:val="center"/>
             <w:shd w:fill="EAF2F8"/>
             <w:tcMar>
@@ -5249,7 +5136,7 @@
         </w:tc>
         <w:tc>
           <w:tcPr>
-            <w:tcW w:type="dxa" w:w="1224"/>
+            <w:tcW w:type="dxa" w:w="1800"/>
             <w:vAlign w:val="center"/>
             <w:shd w:fill="EAF2F8"/>
             <w:tcMar>
@@ -5279,7 +5166,7 @@
                 <w:color w:val="000000"/>
                 <w:sz w:val="18"/>
               </w:rPr>
-              <w:t>5</w:t>
+              <w:t>Уточняются</w:t>
             </w:r>
           </w:p>
         </w:tc>
@@ -5326,7 +5213,7 @@
         </w:tc>
         <w:tc>
           <w:tcPr>
-            <w:tcW w:type="dxa" w:w="7704"/>
+            <w:tcW w:type="dxa" w:w="7128"/>
             <w:vAlign w:val="center"/>
             <w:shd w:fill="FFFFFF"/>
             <w:tcMar>
@@ -5362,7 +5249,7 @@
         </w:tc>
         <w:tc>
           <w:tcPr>
-            <w:tcW w:type="dxa" w:w="1224"/>
+            <w:tcW w:type="dxa" w:w="1800"/>
             <w:vAlign w:val="center"/>
             <w:shd w:fill="FFFFFF"/>
             <w:tcMar>
@@ -5392,7 +5279,7 @@
                 <w:color w:val="000000"/>
                 <w:sz w:val="18"/>
               </w:rPr>
-              <w:t>5</w:t>
+              <w:t>Уточняются</w:t>
             </w:r>
           </w:p>
         </w:tc>
@@ -5439,7 +5326,7 @@
         </w:tc>
         <w:tc>
           <w:tcPr>
-            <w:tcW w:type="dxa" w:w="7704"/>
+            <w:tcW w:type="dxa" w:w="7128"/>
             <w:vAlign w:val="center"/>
             <w:shd w:fill="EAF2F8"/>
             <w:tcMar>
@@ -5475,7 +5362,7 @@
         </w:tc>
         <w:tc>
           <w:tcPr>
-            <w:tcW w:type="dxa" w:w="1224"/>
+            <w:tcW w:type="dxa" w:w="1800"/>
             <w:vAlign w:val="center"/>
             <w:shd w:fill="EAF2F8"/>
             <w:tcMar>
@@ -5505,7 +5392,7 @@
                 <w:color w:val="000000"/>
                 <w:sz w:val="18"/>
               </w:rPr>
-              <w:t>4</w:t>
+              <w:t>Уточняются</w:t>
             </w:r>
           </w:p>
         </w:tc>
@@ -5552,7 +5439,7 @@
         </w:tc>
         <w:tc>
           <w:tcPr>
-            <w:tcW w:type="dxa" w:w="7704"/>
+            <w:tcW w:type="dxa" w:w="7128"/>
             <w:vAlign w:val="center"/>
             <w:shd w:fill="FFFFFF"/>
             <w:tcMar>
@@ -5588,7 +5475,7 @@
         </w:tc>
         <w:tc>
           <w:tcPr>
-            <w:tcW w:type="dxa" w:w="1224"/>
+            <w:tcW w:type="dxa" w:w="1800"/>
             <w:vAlign w:val="center"/>
             <w:shd w:fill="FFFFFF"/>
             <w:tcMar>
@@ -5618,7 +5505,7 @@
                 <w:color w:val="000000"/>
                 <w:sz w:val="18"/>
               </w:rPr>
-              <w:t>4</w:t>
+              <w:t>Уточняются</w:t>
             </w:r>
           </w:p>
         </w:tc>
@@ -5710,434 +5597,8 @@
           <w:color w:val="000000"/>
           <w:sz w:val="21"/>
         </w:rPr>
-        <w:t>Можно получить до 5 бонусных баллов; итоговый рейтинг не может превышать 100 баллов.</w:t>
+        <w:t>Точное количество работ, сроки, максимальные баллы и правила пересдачи будут утверждены отдельно.</w:t>
       </w:r>
-    </w:p>
-    <w:p>
-      <w:pPr>
-        <w:pStyle w:val="ListBullet"/>
-        <w:spacing w:after="20" w:line="252" w:lineRule="auto"/>
-      </w:pPr>
-      <w:r>
-        <w:rPr>
-          <w:rFonts w:ascii="Arial" w:hAnsi="Arial" w:eastAsia="Arial"/>
-          <w:b w:val="0"/>
-          <w:color w:val="000000"/>
-          <w:sz w:val="21"/>
-        </w:rPr>
-        <w:t>Рекомендуемый обязательный минимум за экзамен — 8 из 20 баллов.</w:t>
-      </w:r>
-    </w:p>
-    <w:p>
-      <w:pPr>
-        <w:pStyle w:val="Heading1"/>
-        <w:keepNext/>
-      </w:pPr>
-      <w:r>
-        <w:t>Шкала итоговой оценки</w:t>
-      </w:r>
-    </w:p>
-    <w:tbl>
-      <w:tblPr>
-        <w:tblW w:type="auto" w:w="0"/>
-        <w:jc w:val="center"/>
-        <w:tblLayout w:type="fixed"/>
-        <w:tblLook w:firstColumn="1" w:firstRow="1" w:lastColumn="0" w:lastRow="0" w:noHBand="0" w:noVBand="1" w:val="04A0"/>
-      </w:tblPr>
-      <w:tblGrid>
-        <w:gridCol w:w="5141"/>
-        <w:gridCol w:w="5141"/>
-      </w:tblGrid>
-      <w:tr>
-        <w:trPr>
-          <w:tblHeader w:val="true"/>
-        </w:trPr>
-        <w:tc>
-          <w:tcPr>
-            <w:tcW w:type="dxa" w:w="2160"/>
-            <w:vAlign w:val="center"/>
-            <w:shd w:fill="17365D"/>
-            <w:tcMar>
-              <w:top w:w="110" w:type="dxa"/>
-              <w:start w:w="100" w:type="dxa"/>
-              <w:bottom w:w="110" w:type="dxa"/>
-              <w:end w:w="100" w:type="dxa"/>
-            </w:tcMar>
-            <w:tcBorders>
-              <w:top w:val="single" w:sz="6" w:color="D9D9D9"/>
-              <w:left w:val="single" w:sz="6" w:color="D9D9D9"/>
-              <w:bottom w:val="single" w:sz="6" w:color="D9D9D9"/>
-              <w:right w:val="single" w:sz="6" w:color="D9D9D9"/>
-              <w:insideH w:val="single" w:sz="6" w:color="D9D9D9"/>
-              <w:insideV w:val="single" w:sz="6" w:color="D9D9D9"/>
-            </w:tcBorders>
-          </w:tcPr>
-          <w:p>
-            <w:pPr>
-              <w:spacing w:after="0" w:line="240" w:lineRule="auto"/>
-              <w:jc w:val="center"/>
-            </w:pPr>
-            <w:r>
-              <w:rPr>
-                <w:rFonts w:ascii="Arial" w:hAnsi="Arial" w:eastAsia="Arial"/>
-                <w:b/>
-                <w:color w:val="FFFFFF"/>
-                <w:sz w:val="18"/>
-              </w:rPr>
-              <w:t>Баллы</w:t>
-            </w:r>
-          </w:p>
-        </w:tc>
-        <w:tc>
-          <w:tcPr>
-            <w:tcW w:type="dxa" w:w="7920"/>
-            <w:vAlign w:val="center"/>
-            <w:shd w:fill="17365D"/>
-            <w:tcMar>
-              <w:top w:w="110" w:type="dxa"/>
-              <w:start w:w="100" w:type="dxa"/>
-              <w:bottom w:w="110" w:type="dxa"/>
-              <w:end w:w="100" w:type="dxa"/>
-            </w:tcMar>
-            <w:tcBorders>
-              <w:top w:val="single" w:sz="6" w:color="D9D9D9"/>
-              <w:left w:val="single" w:sz="6" w:color="D9D9D9"/>
-              <w:bottom w:val="single" w:sz="6" w:color="D9D9D9"/>
-              <w:right w:val="single" w:sz="6" w:color="D9D9D9"/>
-              <w:insideH w:val="single" w:sz="6" w:color="D9D9D9"/>
-              <w:insideV w:val="single" w:sz="6" w:color="D9D9D9"/>
-            </w:tcBorders>
-          </w:tcPr>
-          <w:p>
-            <w:pPr>
-              <w:spacing w:after="0" w:line="240" w:lineRule="auto"/>
-              <w:jc w:val="center"/>
-            </w:pPr>
-            <w:r>
-              <w:rPr>
-                <w:rFonts w:ascii="Arial" w:hAnsi="Arial" w:eastAsia="Arial"/>
-                <w:b/>
-                <w:color w:val="FFFFFF"/>
-                <w:sz w:val="18"/>
-              </w:rPr>
-              <w:t>Оценка</w:t>
-            </w:r>
-          </w:p>
-        </w:tc>
-      </w:tr>
-      <w:tr>
-        <w:trPr>
-          <w:cantSplit/>
-        </w:trPr>
-        <w:tc>
-          <w:tcPr>
-            <w:tcW w:type="dxa" w:w="2160"/>
-            <w:vAlign w:val="center"/>
-            <w:shd w:fill="FFFFFF"/>
-            <w:tcMar>
-              <w:top w:w="100" w:type="dxa"/>
-              <w:start w:w="110" w:type="dxa"/>
-              <w:bottom w:w="100" w:type="dxa"/>
-              <w:end w:w="110" w:type="dxa"/>
-            </w:tcMar>
-            <w:tcBorders>
-              <w:top w:val="single" w:sz="6" w:color="D9D9D9"/>
-              <w:left w:val="single" w:sz="6" w:color="D9D9D9"/>
-              <w:bottom w:val="single" w:sz="6" w:color="D9D9D9"/>
-              <w:right w:val="single" w:sz="6" w:color="D9D9D9"/>
-              <w:insideH w:val="single" w:sz="6" w:color="D9D9D9"/>
-              <w:insideV w:val="single" w:sz="6" w:color="D9D9D9"/>
-            </w:tcBorders>
-          </w:tcPr>
-          <w:p>
-            <w:pPr>
-              <w:spacing w:after="0" w:line="247" w:lineRule="auto"/>
-              <w:jc w:val="center"/>
-            </w:pPr>
-            <w:r>
-              <w:rPr>
-                <w:rFonts w:ascii="Arial" w:hAnsi="Arial" w:eastAsia="Arial"/>
-                <w:b w:val="0"/>
-                <w:color w:val="000000"/>
-                <w:sz w:val="19"/>
-              </w:rPr>
-              <w:t>85–100</w:t>
-            </w:r>
-          </w:p>
-        </w:tc>
-        <w:tc>
-          <w:tcPr>
-            <w:tcW w:type="dxa" w:w="7920"/>
-            <w:vAlign w:val="center"/>
-            <w:shd w:fill="FFFFFF"/>
-            <w:tcMar>
-              <w:top w:w="100" w:type="dxa"/>
-              <w:start w:w="110" w:type="dxa"/>
-              <w:bottom w:w="100" w:type="dxa"/>
-              <w:end w:w="110" w:type="dxa"/>
-            </w:tcMar>
-            <w:tcBorders>
-              <w:top w:val="single" w:sz="6" w:color="D9D9D9"/>
-              <w:left w:val="single" w:sz="6" w:color="D9D9D9"/>
-              <w:bottom w:val="single" w:sz="6" w:color="D9D9D9"/>
-              <w:right w:val="single" w:sz="6" w:color="D9D9D9"/>
-              <w:insideH w:val="single" w:sz="6" w:color="D9D9D9"/>
-              <w:insideV w:val="single" w:sz="6" w:color="D9D9D9"/>
-            </w:tcBorders>
-          </w:tcPr>
-          <w:p>
-            <w:pPr>
-              <w:spacing w:after="0" w:line="247" w:lineRule="auto"/>
-              <w:jc w:val="left"/>
-            </w:pPr>
-            <w:r>
-              <w:rPr>
-                <w:rFonts w:ascii="Arial" w:hAnsi="Arial" w:eastAsia="Arial"/>
-                <w:b w:val="0"/>
-                <w:color w:val="000000"/>
-                <w:sz w:val="19"/>
-              </w:rPr>
-              <w:t>Отлично</w:t>
-            </w:r>
-          </w:p>
-        </w:tc>
-      </w:tr>
-      <w:tr>
-        <w:trPr>
-          <w:cantSplit/>
-        </w:trPr>
-        <w:tc>
-          <w:tcPr>
-            <w:tcW w:type="dxa" w:w="2160"/>
-            <w:vAlign w:val="center"/>
-            <w:shd w:fill="EAF2F8"/>
-            <w:tcMar>
-              <w:top w:w="100" w:type="dxa"/>
-              <w:start w:w="110" w:type="dxa"/>
-              <w:bottom w:w="100" w:type="dxa"/>
-              <w:end w:w="110" w:type="dxa"/>
-            </w:tcMar>
-            <w:tcBorders>
-              <w:top w:val="single" w:sz="6" w:color="D9D9D9"/>
-              <w:left w:val="single" w:sz="6" w:color="D9D9D9"/>
-              <w:bottom w:val="single" w:sz="6" w:color="D9D9D9"/>
-              <w:right w:val="single" w:sz="6" w:color="D9D9D9"/>
-              <w:insideH w:val="single" w:sz="6" w:color="D9D9D9"/>
-              <w:insideV w:val="single" w:sz="6" w:color="D9D9D9"/>
-            </w:tcBorders>
-          </w:tcPr>
-          <w:p>
-            <w:pPr>
-              <w:spacing w:after="0" w:line="247" w:lineRule="auto"/>
-              <w:jc w:val="center"/>
-            </w:pPr>
-            <w:r>
-              <w:rPr>
-                <w:rFonts w:ascii="Arial" w:hAnsi="Arial" w:eastAsia="Arial"/>
-                <w:b w:val="0"/>
-                <w:color w:val="000000"/>
-                <w:sz w:val="19"/>
-              </w:rPr>
-              <w:t>71–84</w:t>
-            </w:r>
-          </w:p>
-        </w:tc>
-        <w:tc>
-          <w:tcPr>
-            <w:tcW w:type="dxa" w:w="7920"/>
-            <w:vAlign w:val="center"/>
-            <w:shd w:fill="EAF2F8"/>
-            <w:tcMar>
-              <w:top w:w="100" w:type="dxa"/>
-              <w:start w:w="110" w:type="dxa"/>
-              <w:bottom w:w="100" w:type="dxa"/>
-              <w:end w:w="110" w:type="dxa"/>
-            </w:tcMar>
-            <w:tcBorders>
-              <w:top w:val="single" w:sz="6" w:color="D9D9D9"/>
-              <w:left w:val="single" w:sz="6" w:color="D9D9D9"/>
-              <w:bottom w:val="single" w:sz="6" w:color="D9D9D9"/>
-              <w:right w:val="single" w:sz="6" w:color="D9D9D9"/>
-              <w:insideH w:val="single" w:sz="6" w:color="D9D9D9"/>
-              <w:insideV w:val="single" w:sz="6" w:color="D9D9D9"/>
-            </w:tcBorders>
-          </w:tcPr>
-          <w:p>
-            <w:pPr>
-              <w:spacing w:after="0" w:line="247" w:lineRule="auto"/>
-              <w:jc w:val="left"/>
-            </w:pPr>
-            <w:r>
-              <w:rPr>
-                <w:rFonts w:ascii="Arial" w:hAnsi="Arial" w:eastAsia="Arial"/>
-                <w:b w:val="0"/>
-                <w:color w:val="000000"/>
-                <w:sz w:val="19"/>
-              </w:rPr>
-              <w:t>Хорошо</w:t>
-            </w:r>
-          </w:p>
-        </w:tc>
-      </w:tr>
-      <w:tr>
-        <w:trPr>
-          <w:cantSplit/>
-        </w:trPr>
-        <w:tc>
-          <w:tcPr>
-            <w:tcW w:type="dxa" w:w="2160"/>
-            <w:vAlign w:val="center"/>
-            <w:shd w:fill="FFFFFF"/>
-            <w:tcMar>
-              <w:top w:w="100" w:type="dxa"/>
-              <w:start w:w="110" w:type="dxa"/>
-              <w:bottom w:w="100" w:type="dxa"/>
-              <w:end w:w="110" w:type="dxa"/>
-            </w:tcMar>
-            <w:tcBorders>
-              <w:top w:val="single" w:sz="6" w:color="D9D9D9"/>
-              <w:left w:val="single" w:sz="6" w:color="D9D9D9"/>
-              <w:bottom w:val="single" w:sz="6" w:color="D9D9D9"/>
-              <w:right w:val="single" w:sz="6" w:color="D9D9D9"/>
-              <w:insideH w:val="single" w:sz="6" w:color="D9D9D9"/>
-              <w:insideV w:val="single" w:sz="6" w:color="D9D9D9"/>
-            </w:tcBorders>
-          </w:tcPr>
-          <w:p>
-            <w:pPr>
-              <w:spacing w:after="0" w:line="247" w:lineRule="auto"/>
-              <w:jc w:val="center"/>
-            </w:pPr>
-            <w:r>
-              <w:rPr>
-                <w:rFonts w:ascii="Arial" w:hAnsi="Arial" w:eastAsia="Arial"/>
-                <w:b w:val="0"/>
-                <w:color w:val="000000"/>
-                <w:sz w:val="19"/>
-              </w:rPr>
-              <w:t>60–70</w:t>
-            </w:r>
-          </w:p>
-        </w:tc>
-        <w:tc>
-          <w:tcPr>
-            <w:tcW w:type="dxa" w:w="7920"/>
-            <w:vAlign w:val="center"/>
-            <w:shd w:fill="FFFFFF"/>
-            <w:tcMar>
-              <w:top w:w="100" w:type="dxa"/>
-              <w:start w:w="110" w:type="dxa"/>
-              <w:bottom w:w="100" w:type="dxa"/>
-              <w:end w:w="110" w:type="dxa"/>
-            </w:tcMar>
-            <w:tcBorders>
-              <w:top w:val="single" w:sz="6" w:color="D9D9D9"/>
-              <w:left w:val="single" w:sz="6" w:color="D9D9D9"/>
-              <w:bottom w:val="single" w:sz="6" w:color="D9D9D9"/>
-              <w:right w:val="single" w:sz="6" w:color="D9D9D9"/>
-              <w:insideH w:val="single" w:sz="6" w:color="D9D9D9"/>
-              <w:insideV w:val="single" w:sz="6" w:color="D9D9D9"/>
-            </w:tcBorders>
-          </w:tcPr>
-          <w:p>
-            <w:pPr>
-              <w:spacing w:after="0" w:line="247" w:lineRule="auto"/>
-              <w:jc w:val="left"/>
-            </w:pPr>
-            <w:r>
-              <w:rPr>
-                <w:rFonts w:ascii="Arial" w:hAnsi="Arial" w:eastAsia="Arial"/>
-                <w:b w:val="0"/>
-                <w:color w:val="000000"/>
-                <w:sz w:val="19"/>
-              </w:rPr>
-              <w:t>Удовлетворительно</w:t>
-            </w:r>
-          </w:p>
-        </w:tc>
-      </w:tr>
-      <w:tr>
-        <w:trPr>
-          <w:cantSplit/>
-        </w:trPr>
-        <w:tc>
-          <w:tcPr>
-            <w:tcW w:type="dxa" w:w="2160"/>
-            <w:vAlign w:val="center"/>
-            <w:shd w:fill="EAF2F8"/>
-            <w:tcMar>
-              <w:top w:w="100" w:type="dxa"/>
-              <w:start w:w="110" w:type="dxa"/>
-              <w:bottom w:w="100" w:type="dxa"/>
-              <w:end w:w="110" w:type="dxa"/>
-            </w:tcMar>
-            <w:tcBorders>
-              <w:top w:val="single" w:sz="6" w:color="D9D9D9"/>
-              <w:left w:val="single" w:sz="6" w:color="D9D9D9"/>
-              <w:bottom w:val="single" w:sz="6" w:color="D9D9D9"/>
-              <w:right w:val="single" w:sz="6" w:color="D9D9D9"/>
-              <w:insideH w:val="single" w:sz="6" w:color="D9D9D9"/>
-              <w:insideV w:val="single" w:sz="6" w:color="D9D9D9"/>
-            </w:tcBorders>
-          </w:tcPr>
-          <w:p>
-            <w:pPr>
-              <w:spacing w:after="0" w:line="247" w:lineRule="auto"/>
-              <w:jc w:val="center"/>
-            </w:pPr>
-            <w:r>
-              <w:rPr>
-                <w:rFonts w:ascii="Arial" w:hAnsi="Arial" w:eastAsia="Arial"/>
-                <w:b w:val="0"/>
-                <w:color w:val="000000"/>
-                <w:sz w:val="19"/>
-              </w:rPr>
-              <w:t>0–59</w:t>
-            </w:r>
-          </w:p>
-        </w:tc>
-        <w:tc>
-          <w:tcPr>
-            <w:tcW w:type="dxa" w:w="7920"/>
-            <w:vAlign w:val="center"/>
-            <w:shd w:fill="EAF2F8"/>
-            <w:tcMar>
-              <w:top w:w="100" w:type="dxa"/>
-              <w:start w:w="110" w:type="dxa"/>
-              <w:bottom w:w="100" w:type="dxa"/>
-              <w:end w:w="110" w:type="dxa"/>
-            </w:tcMar>
-            <w:tcBorders>
-              <w:top w:val="single" w:sz="6" w:color="D9D9D9"/>
-              <w:left w:val="single" w:sz="6" w:color="D9D9D9"/>
-              <w:bottom w:val="single" w:sz="6" w:color="D9D9D9"/>
-              <w:right w:val="single" w:sz="6" w:color="D9D9D9"/>
-              <w:insideH w:val="single" w:sz="6" w:color="D9D9D9"/>
-              <w:insideV w:val="single" w:sz="6" w:color="D9D9D9"/>
-            </w:tcBorders>
-          </w:tcPr>
-          <w:p>
-            <w:pPr>
-              <w:spacing w:after="0" w:line="247" w:lineRule="auto"/>
-              <w:jc w:val="left"/>
-            </w:pPr>
-            <w:r>
-              <w:rPr>
-                <w:rFonts w:ascii="Arial" w:hAnsi="Arial" w:eastAsia="Arial"/>
-                <w:b w:val="0"/>
-                <w:color w:val="000000"/>
-                <w:sz w:val="19"/>
-              </w:rPr>
-              <w:t>Неудовлетворительно</w:t>
-            </w:r>
-          </w:p>
-        </w:tc>
-      </w:tr>
-    </w:tbl>
-    <w:p>
-      <w:pPr>
-        <w:spacing w:after="20"/>
-      </w:pPr>
     </w:p>
     <w:p>
       <w:pPr>

</xml_diff>